<commit_message>
fix(arxiv): incluir clg_references.bib e CLG_FOUNDATIONS_ARXIV.bbl pre-compilado para sanar bloqueador de submissao
</commit_message>
<xml_diff>
--- a/Publicacoes/MensagemParaOAvaliador19.docx
+++ b/Publicacoes/MensagemParaOAvaliador19.docx
@@ -174,7 +174,22 @@
           <w:color w:val="222222"/>
           <w:sz w:val="22"/>
         </w:rPr>
-        <w:t>Seguem anexos no pacote consolidado Enviar_19.zip: a transcrição do Parecer nº 19, a Resposta Técnica Detalhada (MD e DOCX), a presente Mensagem (TXT e DOCX), o manuscrito CLG_FOUNDATIONS_ARXIV.tex revisado, a monografia analítica ESTUDO_ANALITICO_DO_CONJUNTO_CRITICO.md, a suíte de testes e o arquivo compilável arxiv_package.zip.</w:t>
+        <w:t>8. Bibliografia e Arquivo BBL Pré-compilado para o arXiv:</w:t>
+        <w:br/>
+        <w:t xml:space="preserve">   Sanamos em definitivo o bloqueador de compilação bibliográfica: incluímos clg_references.bib e geramos o arquivo CLG_FOUNDATIONS_ARXIV.bbl (formatado estritamente no padrão BibTeX plain para as 26 referências citadas). Ambos foram incorporados tanto ao pacote interno arxiv_package.zip quanto à raiz do pacote consolidado Enviar_19.zip, garantindo compilação direta e sem dependência de passos adicionais nos servidores automatizados do arXiv.</w:t>
+      </w:r>
+    </w:p>
+    <w:p>
+      <w:pPr>
+        <w:spacing w:after="160" w:line="276" w:lineRule="auto"/>
+      </w:pPr>
+      <w:r>
+        <w:rPr>
+          <w:rFonts w:ascii="Calibri" w:hAnsi="Calibri"/>
+          <w:color w:val="222222"/>
+          <w:sz w:val="22"/>
+        </w:rPr>
+        <w:t>Seguem anexos no pacote consolidado Enviar_19.zip: a transcrição do Parecer nº 19, a Resposta Técnica Detalhada (MD e DOCX), a presente Mensagem (TXT e DOCX), o manuscrito CLG_FOUNDATIONS_ARXIV.tex revisado, a monografia analítica ESTUDO_ANALITICO_DO_CONJUNTO_CRITICO.md, a suíte de testes, os arquivos bibliográficos (clg_references.bib e CLG_FOUNDATIONS_ARXIV.bbl) e o arquivo compilável arxiv_package.zip.</w:t>
       </w:r>
     </w:p>
     <w:p>

</xml_diff>